<commit_message>
Implement strict role-based access control with complete data isolation
</commit_message>
<xml_diff>
--- a/የመሸኛ ደብደዳቤ winnerformat.docx
+++ b/የመሸኛ ደብደዳቤ winnerformat.docx
@@ -8,6 +8,7 @@
         <w:tabs>
           <w:tab w:val="left" w:pos="4538"/>
         </w:tabs>
+        <w:jc w:val="both"/>
         <w:rPr>
           <w:rFonts w:hint="default" w:ascii="Power Geez Unicode3" w:hAnsi="Power Geez Unicode3" w:cs="Ebrima"/>
           <w:sz w:val="20"/>
@@ -15,6 +16,8 @@
           <w:lang w:val="en-US"/>
         </w:rPr>
       </w:pPr>
+      <w:bookmarkStart w:id="0" w:name="_GoBack"/>
+      <w:bookmarkEnd w:id="0"/>
       <w:r>
         <w:rPr>
           <w:rFonts w:ascii="Power Geez Unicode3" w:hAnsi="Power Geez Unicode3"/>
@@ -264,17 +267,6 @@
           </wp:anchor>
         </w:drawing>
       </w:r>
-      <w:r>
-        <w:rPr>
-          <w:rFonts w:hint="default" w:ascii="Power Geez Unicode3" w:hAnsi="Power Geez Unicode3" w:cs="Ebrima"/>
-          <w:sz w:val="20"/>
-          <w:szCs w:val="20"/>
-          <w:lang w:val="en-US"/>
-        </w:rPr>
-        <w:t>kk</w:t>
-      </w:r>
-      <w:bookmarkStart w:id="0" w:name="_GoBack"/>
-      <w:bookmarkEnd w:id="0"/>
     </w:p>
     <w:sectPr>
       <w:headerReference r:id="rId7" w:type="first"/>
@@ -1983,8 +1975,8 @@
     <w:lsdException w:uiPriority="99" w:name="Normal Indent"/>
     <w:lsdException w:uiPriority="99" w:name="footnote text"/>
     <w:lsdException w:uiPriority="99" w:name="annotation text"/>
-    <w:lsdException w:uiPriority="99" w:semiHidden="0" w:name="header"/>
-    <w:lsdException w:uiPriority="99" w:semiHidden="0" w:name="footer"/>
+    <w:lsdException w:qFormat="1" w:uiPriority="99" w:semiHidden="0" w:name="header"/>
+    <w:lsdException w:qFormat="1" w:uiPriority="99" w:semiHidden="0" w:name="footer"/>
     <w:lsdException w:uiPriority="99" w:name="index heading"/>
     <w:lsdException w:qFormat="1" w:uiPriority="35" w:name="caption"/>
     <w:lsdException w:uiPriority="99" w:name="table of figures"/>
@@ -2017,7 +2009,7 @@
     <w:lsdException w:qFormat="1" w:unhideWhenUsed="0" w:uiPriority="10" w:semiHidden="0" w:name="Title"/>
     <w:lsdException w:uiPriority="99" w:name="Closing"/>
     <w:lsdException w:uiPriority="99" w:name="Signature"/>
-    <w:lsdException w:uiPriority="1" w:name="Default Paragraph Font"/>
+    <w:lsdException w:qFormat="1" w:uiPriority="1" w:name="Default Paragraph Font"/>
     <w:lsdException w:uiPriority="99" w:name="Body Text"/>
     <w:lsdException w:uiPriority="99" w:name="Body Text Indent"/>
     <w:lsdException w:uiPriority="99" w:name="List Continue"/>
@@ -2037,7 +2029,7 @@
     <w:lsdException w:uiPriority="99" w:name="Body Text Indent 2"/>
     <w:lsdException w:uiPriority="99" w:name="Body Text Indent 3"/>
     <w:lsdException w:uiPriority="99" w:name="Block Text"/>
-    <w:lsdException w:uiPriority="99" w:semiHidden="0" w:name="Hyperlink"/>
+    <w:lsdException w:qFormat="1" w:uiPriority="99" w:semiHidden="0" w:name="Hyperlink"/>
     <w:lsdException w:uiPriority="99" w:name="FollowedHyperlink"/>
     <w:lsdException w:qFormat="1" w:unhideWhenUsed="0" w:uiPriority="22" w:semiHidden="0" w:name="Strong"/>
     <w:lsdException w:qFormat="1" w:unhideWhenUsed="0" w:uiPriority="20" w:semiHidden="0" w:name="Emphasis"/>
@@ -2051,11 +2043,11 @@
     <w:lsdException w:uiPriority="99" w:name="HTML Code"/>
     <w:lsdException w:uiPriority="99" w:name="HTML Definition"/>
     <w:lsdException w:uiPriority="99" w:name="HTML Keyboard"/>
-    <w:lsdException w:uiPriority="99" w:name="HTML Preformatted"/>
+    <w:lsdException w:qFormat="1" w:uiPriority="99" w:name="HTML Preformatted"/>
     <w:lsdException w:uiPriority="99" w:name="HTML Sample"/>
     <w:lsdException w:uiPriority="99" w:name="HTML Typewriter"/>
     <w:lsdException w:uiPriority="99" w:name="HTML Variable"/>
-    <w:lsdException w:uiPriority="99" w:name="Normal Table"/>
+    <w:lsdException w:qFormat="1" w:uiPriority="99" w:name="Normal Table"/>
     <w:lsdException w:uiPriority="99" w:name="annotation subject"/>
     <w:lsdException w:uiPriority="99" w:name="Table Simple 1"/>
     <w:lsdException w:uiPriority="99" w:name="Table Simple 2"/>
@@ -2099,7 +2091,7 @@
     <w:lsdException w:uiPriority="99" w:name="Table Web 1"/>
     <w:lsdException w:uiPriority="99" w:name="Table Web 2"/>
     <w:lsdException w:uiPriority="99" w:name="Table Web 3"/>
-    <w:lsdException w:uiPriority="99" w:name="Balloon Text"/>
+    <w:lsdException w:qFormat="1" w:uiPriority="99" w:name="Balloon Text"/>
     <w:lsdException w:unhideWhenUsed="0" w:uiPriority="59" w:semiHidden="0" w:name="Table Grid"/>
     <w:lsdException w:uiPriority="99" w:name="Table Theme"/>
     <w:lsdException w:unhideWhenUsed="0" w:uiPriority="60" w:semiHidden="0" w:name="Light Shading"/>
@@ -2224,12 +2216,14 @@
     <w:name w:val="Default Paragraph Font"/>
     <w:semiHidden/>
     <w:unhideWhenUsed/>
+    <w:qFormat/>
     <w:uiPriority w:val="1"/>
   </w:style>
   <w:style w:type="table" w:default="1" w:styleId="3">
     <w:name w:val="Normal Table"/>
     <w:semiHidden/>
     <w:unhideWhenUsed/>
+    <w:qFormat/>
     <w:uiPriority w:val="99"/>
     <w:tblPr>
       <w:tblCellMar>
@@ -2246,6 +2240,7 @@
     <w:link w:val="11"/>
     <w:semiHidden/>
     <w:unhideWhenUsed/>
+    <w:qFormat/>
     <w:uiPriority w:val="99"/>
     <w:pPr>
       <w:widowControl/>
@@ -2263,6 +2258,7 @@
     <w:basedOn w:val="1"/>
     <w:link w:val="10"/>
     <w:unhideWhenUsed/>
+    <w:qFormat/>
     <w:uiPriority w:val="99"/>
     <w:pPr>
       <w:widowControl/>
@@ -2279,6 +2275,7 @@
     <w:basedOn w:val="1"/>
     <w:link w:val="9"/>
     <w:unhideWhenUsed/>
+    <w:qFormat/>
     <w:uiPriority w:val="99"/>
     <w:pPr>
       <w:widowControl/>
@@ -2296,6 +2293,7 @@
     <w:link w:val="12"/>
     <w:semiHidden/>
     <w:unhideWhenUsed/>
+    <w:qFormat/>
     <w:uiPriority w:val="99"/>
     <w:pPr>
       <w:widowControl/>
@@ -2329,6 +2327,7 @@
   <w:style w:type="character" w:styleId="8">
     <w:name w:val="Hyperlink"/>
     <w:unhideWhenUsed/>
+    <w:qFormat/>
     <w:uiPriority w:val="99"/>
     <w:rPr>
       <w:color w:val="0000FF"/>
@@ -2339,12 +2338,14 @@
     <w:name w:val="Header Char"/>
     <w:basedOn w:val="2"/>
     <w:link w:val="6"/>
+    <w:qFormat/>
     <w:uiPriority w:val="99"/>
   </w:style>
   <w:style w:type="character" w:customStyle="1" w:styleId="10">
     <w:name w:val="Footer Char"/>
     <w:basedOn w:val="2"/>
     <w:link w:val="5"/>
+    <w:qFormat/>
     <w:uiPriority w:val="99"/>
   </w:style>
   <w:style w:type="character" w:customStyle="1" w:styleId="11">
@@ -2352,6 +2353,7 @@
     <w:basedOn w:val="2"/>
     <w:link w:val="4"/>
     <w:semiHidden/>
+    <w:qFormat/>
     <w:uiPriority w:val="99"/>
     <w:rPr>
       <w:rFonts w:ascii="Tahoma" w:hAnsi="Tahoma" w:cs="Tahoma"/>
@@ -2364,6 +2366,7 @@
     <w:basedOn w:val="2"/>
     <w:link w:val="7"/>
     <w:semiHidden/>
+    <w:qFormat/>
     <w:uiPriority w:val="99"/>
     <w:rPr>
       <w:rFonts w:ascii="Courier New" w:hAnsi="Courier New" w:eastAsia="Times New Roman" w:cs="Courier New"/>
@@ -2374,6 +2377,7 @@
   <w:style w:type="character" w:customStyle="1" w:styleId="13">
     <w:name w:val="y2iqfc"/>
     <w:basedOn w:val="2"/>
+    <w:qFormat/>
     <w:uiPriority w:val="0"/>
   </w:style>
   <w:style w:type="paragraph" w:styleId="14">
@@ -2454,6 +2458,7 @@
     <w:name w:val="Intense Quote Char"/>
     <w:basedOn w:val="2"/>
     <w:link w:val="17"/>
+    <w:qFormat/>
     <w:uiPriority w:val="30"/>
     <w:rPr>
       <w:b/>

</xml_diff>

<commit_message>
Update winner template: manual ቁጥር/ቀን fields, Geez 3 font
</commit_message>
<xml_diff>
--- a/የመሸኛ ደብደዳቤ winnerformat.docx
+++ b/የመሸኛ ደብደዳቤ winnerformat.docx
@@ -7,7 +7,10 @@
         <w:spacing w:after="200"/>
       </w:pPr>
       <w:r>
-        <w:t xml:space="preserve">ቁጥር/Ref.No: {refNumber}</w:t>
+        <w:rPr>
+          <w:rFonts w:ascii="Geez 3" w:cs="Geez 3" w:eastAsia="Geez 3" w:hAnsi="Geez 3"/>
+        </w:rPr>
+        <w:t xml:space="preserve">ቁጥር፡- ___________________</w:t>
       </w:r>
     </w:p>
     <w:p>
@@ -15,7 +18,10 @@
         <w:spacing w:after="400"/>
       </w:pPr>
       <w:r>
-        <w:t xml:space="preserve">ቀን /Date: {date}</w:t>
+        <w:rPr>
+          <w:rFonts w:ascii="Geez 3" w:cs="Geez 3" w:eastAsia="Geez 3" w:hAnsi="Geez 3"/>
+        </w:rPr>
+        <w:t xml:space="preserve">ቀን፡- ___________________</w:t>
       </w:r>
     </w:p>
     <w:p>
@@ -23,6 +29,9 @@
         <w:spacing w:after="200"/>
       </w:pPr>
       <w:r>
+        <w:rPr>
+          <w:rFonts w:ascii="Geez 3" w:cs="Geez 3" w:eastAsia="Geez 3" w:hAnsi="Geez 3"/>
+        </w:rPr>
         <w:t xml:space="preserve">ለገቢ አሰባሰብና ዋስትና አያያዝ ቡድን</w:t>
       </w:r>
     </w:p>
@@ -32,12 +41,16 @@
       </w:pPr>
       <w:r>
         <w:rPr>
+          <w:rFonts w:ascii="Geez 3" w:cs="Geez 3" w:eastAsia="Geez 3" w:hAnsi="Geez 3"/>
           <w:b/>
           <w:bCs/>
         </w:rPr>
         <w:t xml:space="preserve">ጉዳዩ፤ </w:t>
       </w:r>
       <w:r>
+        <w:rPr>
+          <w:rFonts w:ascii="Geez 3" w:cs="Geez 3" w:eastAsia="Geez 3" w:hAnsi="Geez 3"/>
+        </w:rPr>
         <w:t xml:space="preserve">ክፊያ መቀበለን ይመለከታል</w:t>
       </w:r>
     </w:p>
@@ -47,6 +60,9 @@
         <w:jc w:val="both"/>
       </w:pPr>
       <w:r>
+        <w:rPr>
+          <w:rFonts w:ascii="Geez 3" w:cs="Geez 3" w:eastAsia="Geez 3" w:hAnsi="Geez 3"/>
+        </w:rPr>
         <w:t xml:space="preserve">በቅ/ጽ/ቤታችን ግልፅ ጨረታ ቁጥር {tenderNumber} በ{date} ዓ.ም የተካሄደ መሆኑ ይታወቃል። በዚህ መሠረት ስት {winnerName} በኮድ-{groupCode} የተለየዩ {itemDescription} በብር {winnerPrice} ተወዳድረው አሸናፊ መሆናቸውን እየገለፅን የክፍያ ሁኔታው ከዚህ በታች እንደሚከተለው ቀርቧል።</w:t>
       </w:r>
     </w:p>
@@ -55,6 +71,9 @@
         <w:spacing w:after="100"/>
       </w:pPr>
       <w:r>
+        <w:rPr>
+          <w:rFonts w:ascii="Geez 3" w:cs="Geez 3" w:eastAsia="Geez 3" w:hAnsi="Geez 3"/>
+        </w:rPr>
         <w:t xml:space="preserve">70% ---------------------------------------------------- {calc70}</w:t>
       </w:r>
     </w:p>
@@ -63,6 +82,9 @@
         <w:spacing w:after="100"/>
       </w:pPr>
       <w:r>
+        <w:rPr>
+          <w:rFonts w:ascii="Geez 3" w:cs="Geez 3" w:eastAsia="Geez 3" w:hAnsi="Geez 3"/>
+        </w:rPr>
         <w:t xml:space="preserve">30% ---------------------------------------------------- {calc30}</w:t>
       </w:r>
     </w:p>
@@ -71,6 +93,9 @@
         <w:spacing w:after="100"/>
       </w:pPr>
       <w:r>
+        <w:rPr>
+          <w:rFonts w:ascii="Geez 3" w:cs="Geez 3" w:eastAsia="Geez 3" w:hAnsi="Geez 3"/>
+        </w:rPr>
         <w:t xml:space="preserve">15% (ቫት) --------------------------------------------- {vat}</w:t>
       </w:r>
     </w:p>
@@ -79,6 +104,9 @@
         <w:spacing w:after="400"/>
       </w:pPr>
       <w:r>
+        <w:rPr>
+          <w:rFonts w:ascii="Geez 3" w:cs="Geez 3" w:eastAsia="Geez 3" w:hAnsi="Geez 3"/>
+        </w:rPr>
         <w:t xml:space="preserve">ጠቅላላ ድምር ------------------------------------------- {totalWithVAT}</w:t>
       </w:r>
     </w:p>
@@ -88,6 +116,9 @@
         <w:jc w:val="both"/>
       </w:pPr>
       <w:r>
+        <w:rPr>
+          <w:rFonts w:ascii="Geez 3" w:cs="Geez 3" w:eastAsia="Geez 3" w:hAnsi="Geez 3"/>
+        </w:rPr>
         <w:t xml:space="preserve">ስለሆነም ተጫራቹ ገንዘቡን በድሬዳዋ ጉምሩክ ኮሚሽን ቅ/ጽ/ቤት ስም በተከፈተው 70% በቀጥታ ገቢ አካውት ቁጥር 1000014311762 በጉምርክ ኮሚሽን እና ለፍትህ ሚንስቴር 30%ቱን እና ቫቱን በዲፖዚት አካውንት 1000014260092 ሪሲት አሰርተው ሲያቀርቡ ተቆርጦ እንዲሰጣቸው እያሳሰብን የውርስ እቃ መጋዘን ሀላፊ የክፍያውን መረጃ ይዘው ሲቀርቡ ከዚህ ደብዳቤ ጋር ተያይዞ በቀረበው ዝርዝር መሰረት በሞዴል 266 ወጪ በማድረግ ንብረቱን እንድታስረክቡ እያሳሰብን ለርክክብ ይረዳ ዘንድ የእቃው ዝርዝር 1 ገጽ ከዚህ ደብዳቤ ጋር ያያዝን ሲሆን የእቃ አያያዝ ቡድንም ያሸነፉትን እቃ ክፍያ መፈፀሙን በማረጋገጥ በ 5 የስራ ቀናት ውስጥ ከመጋዘን እናዲያወጡ ለርክክብ ይረዳ ዘንድ ግልባጭ ተደርጎለታል፡፡</w:t>
       </w:r>
     </w:p>
@@ -97,6 +128,9 @@
         <w:jc w:val="center"/>
       </w:pPr>
       <w:r>
+        <w:rPr>
+          <w:rFonts w:ascii="Geez 3" w:cs="Geez 3" w:eastAsia="Geez 3" w:hAnsi="Geez 3"/>
+        </w:rPr>
         <w:t xml:space="preserve">‹‹ከሰላምታ ጋር››</w:t>
       </w:r>
     </w:p>
@@ -106,6 +140,7 @@
       </w:pPr>
       <w:r>
         <w:rPr>
+          <w:rFonts w:ascii="Geez 3" w:cs="Geez 3" w:eastAsia="Geez 3" w:hAnsi="Geez 3"/>
           <w:b/>
           <w:bCs/>
           <w:u w:val="single"/>
@@ -118,6 +153,9 @@
         <w:spacing w:after="100"/>
       </w:pPr>
       <w:r>
+        <w:rPr>
+          <w:rFonts w:ascii="Geez 3" w:cs="Geez 3" w:eastAsia="Geez 3" w:hAnsi="Geez 3"/>
+        </w:rPr>
         <w:t xml:space="preserve">ለጉምሩክ ኦፕሬሽን ም/ስ/አስኪያጅ</w:t>
       </w:r>
     </w:p>
@@ -126,6 +164,9 @@
         <w:spacing w:after="100"/>
       </w:pPr>
       <w:r>
+        <w:rPr>
+          <w:rFonts w:ascii="Geez 3" w:cs="Geez 3" w:eastAsia="Geez 3" w:hAnsi="Geez 3"/>
+        </w:rPr>
         <w:t xml:space="preserve">የተያዙና የተወረሱ ንብ/አስ/የስራ ሂደት</w:t>
       </w:r>
     </w:p>
@@ -134,6 +175,9 @@
         <w:spacing w:after="100"/>
       </w:pPr>
       <w:r>
+        <w:rPr>
+          <w:rFonts w:ascii="Geez 3" w:cs="Geez 3" w:eastAsia="Geez 3" w:hAnsi="Geez 3"/>
+        </w:rPr>
         <w:t xml:space="preserve">ለኢንተለጀንስ እና ኮተረበንድ ክትትል የስራ ሂደት</w:t>
       </w:r>
     </w:p>
@@ -142,6 +186,9 @@
         <w:spacing w:after="100"/>
       </w:pPr>
       <w:r>
+        <w:rPr>
+          <w:rFonts w:ascii="Geez 3" w:cs="Geez 3" w:eastAsia="Geez 3" w:hAnsi="Geez 3"/>
+        </w:rPr>
         <w:t xml:space="preserve">ለእቃ አያያዝ ቡድን</w:t>
       </w:r>
     </w:p>
@@ -150,6 +197,9 @@
         <w:spacing w:after="100"/>
       </w:pPr>
       <w:r>
+        <w:rPr>
+          <w:rFonts w:ascii="Geez 3" w:cs="Geez 3" w:eastAsia="Geez 3" w:hAnsi="Geez 3"/>
+        </w:rPr>
         <w:t xml:space="preserve">ለውርስ እቃ አስወጋጅ ኮሚቴ</w:t>
       </w:r>
     </w:p>
@@ -158,6 +208,9 @@
         <w:spacing w:after="100"/>
       </w:pPr>
       <w:r>
+        <w:rPr>
+          <w:rFonts w:ascii="Geez 3" w:cs="Geez 3" w:eastAsia="Geez 3" w:hAnsi="Geez 3"/>
+        </w:rPr>
         <w:t xml:space="preserve">መጋዘን 1</w:t>
       </w:r>
     </w:p>
@@ -166,6 +219,9 @@
         <w:spacing w:after="100"/>
       </w:pPr>
       <w:r>
+        <w:rPr>
+          <w:rFonts w:ascii="Geez 3" w:cs="Geez 3" w:eastAsia="Geez 3" w:hAnsi="Geez 3"/>
+        </w:rPr>
         <w:t xml:space="preserve">ለበር ጥበቃ</w:t>
       </w:r>
     </w:p>
@@ -174,6 +230,9 @@
         <w:spacing w:after="100"/>
       </w:pPr>
       <w:r>
+        <w:rPr>
+          <w:rFonts w:ascii="Geez 3" w:cs="Geez 3" w:eastAsia="Geez 3" w:hAnsi="Geez 3"/>
+        </w:rPr>
         <w:t xml:space="preserve">ለድ/ለኮን/ቁጥ/ድን/ተሻ/ፖሊ/መምሪያ ሪጅመንት 14</w:t>
       </w:r>
     </w:p>
@@ -182,6 +241,9 @@
         <w:spacing w:after="100"/>
       </w:pPr>
       <w:r>
+        <w:rPr>
+          <w:rFonts w:ascii="Geez 3" w:cs="Geez 3" w:eastAsia="Geez 3" w:hAnsi="Geez 3"/>
+        </w:rPr>
         <w:t xml:space="preserve">ድ/ዳ/ጉ/ኮምሽን</w:t>
       </w:r>
     </w:p>
@@ -190,6 +252,9 @@
         <w:spacing w:after="100"/>
       </w:pPr>
       <w:r>
+        <w:rPr>
+          <w:rFonts w:ascii="Geez 3" w:cs="Geez 3" w:eastAsia="Geez 3" w:hAnsi="Geez 3"/>
+        </w:rPr>
         <w:t xml:space="preserve">አቶ {winnerName}</w:t>
       </w:r>
     </w:p>
@@ -198,6 +263,9 @@
         <w:spacing w:after="100"/>
       </w:pPr>
       <w:r>
+        <w:rPr>
+          <w:rFonts w:ascii="Geez 3" w:cs="Geez 3" w:eastAsia="Geez 3" w:hAnsi="Geez 3"/>
+        </w:rPr>
         <w:t xml:space="preserve">በ/መ</w:t>
       </w:r>
     </w:p>

</xml_diff>

<commit_message>
Change font to Nyala
</commit_message>
<xml_diff>
--- a/የመሸኛ ደብደዳቤ winnerformat.docx
+++ b/የመሸኛ ደብደዳቤ winnerformat.docx
@@ -5,7 +5,8 @@
     <w:p>
       <w:r>
         <w:rPr>
-          <w:rFonts w:ascii="Geez 3" w:hAnsi="Geez 3"/>
+          <w:rFonts w:ascii="Nyala" w:hAnsi="Nyala"/>
+          <w:sz w:val="24"/>
         </w:rPr>
         <w:t>ቁጥር፡- ___________________</w:t>
       </w:r>
@@ -13,7 +14,8 @@
     <w:p>
       <w:r>
         <w:rPr>
-          <w:rFonts w:ascii="Geez 3" w:hAnsi="Geez 3"/>
+          <w:rFonts w:ascii="Nyala" w:hAnsi="Nyala"/>
+          <w:sz w:val="24"/>
         </w:rPr>
         <w:t>ቀን፡- ___________________</w:t>
       </w:r>
@@ -21,15 +23,17 @@
     <w:p>
       <w:r>
         <w:rPr>
-          <w:rFonts w:ascii="Geez 3" w:hAnsi="Geez 3"/>
-        </w:rPr>
-        <w:t xml:space="preserve"> </w:t>
-      </w:r>
-    </w:p>
-    <w:p>
-      <w:r>
-        <w:rPr>
-          <w:rFonts w:ascii="Geez 3" w:hAnsi="Geez 3"/>
+          <w:rFonts w:ascii="Nyala" w:hAnsi="Nyala"/>
+          <w:sz w:val="24"/>
+        </w:rPr>
+        <w:t xml:space="preserve"> </w:t>
+      </w:r>
+    </w:p>
+    <w:p>
+      <w:r>
+        <w:rPr>
+          <w:rFonts w:ascii="Nyala" w:hAnsi="Nyala"/>
+          <w:sz w:val="24"/>
         </w:rPr>
         <w:t>ለገቢ አሰባሰብና ዋስትና አያያዝ ቡድን</w:t>
       </w:r>
@@ -37,22 +41,25 @@
     <w:p>
       <w:r>
         <w:rPr>
-          <w:rFonts w:ascii="Geez 3" w:hAnsi="Geez 3"/>
-        </w:rPr>
-        <w:t xml:space="preserve"> </w:t>
-      </w:r>
-    </w:p>
-    <w:p>
-      <w:r>
-        <w:rPr>
-          <w:rFonts w:ascii="Geez 3" w:hAnsi="Geez 3"/>
+          <w:rFonts w:ascii="Nyala" w:hAnsi="Nyala"/>
+          <w:sz w:val="24"/>
+        </w:rPr>
+        <w:t xml:space="preserve"> </w:t>
+      </w:r>
+    </w:p>
+    <w:p>
+      <w:r>
+        <w:rPr>
+          <w:rFonts w:ascii="Nyala" w:hAnsi="Nyala"/>
+          <w:sz w:val="24"/>
           <w:b/>
         </w:rPr>
         <w:t>ጉዳዩ፤ </w:t>
       </w:r>
       <w:r>
         <w:rPr>
-          <w:rFonts w:ascii="Geez 3" w:hAnsi="Geez 3"/>
+          <w:rFonts w:ascii="Nyala" w:hAnsi="Nyala"/>
+          <w:sz w:val="24"/>
         </w:rPr>
         <w:t>ክፊያ መቀበለን ይመለከታል</w:t>
       </w:r>
@@ -60,7 +67,8 @@
     <w:p>
       <w:r>
         <w:rPr>
-          <w:rFonts w:ascii="Geez 3" w:hAnsi="Geez 3"/>
+          <w:rFonts w:ascii="Nyala" w:hAnsi="Nyala"/>
+          <w:sz w:val="24"/>
         </w:rPr>
         <w:t xml:space="preserve"> </w:t>
       </w:r>
@@ -71,7 +79,8 @@
       </w:pPr>
       <w:r>
         <w:rPr>
-          <w:rFonts w:ascii="Geez 3" w:hAnsi="Geez 3"/>
+          <w:rFonts w:ascii="Nyala" w:hAnsi="Nyala"/>
+          <w:sz w:val="24"/>
         </w:rPr>
         <w:t>በቅ/ጽ/ቤታችን ግልፅ ጨረታ ቁጥር {tenderNumber} በ{date} ዓ.ም የተካሄደ መሆኑ ይታወቃል። በዚህ መሠረት ስት {winnerName} በኮድ-{groupCode} የተለየዩ {itemDescription} በብር {winnerPrice} ተወዳድረው አሸናፊ መሆናቸውን እየገለፅን የክፍያ ሁኔታው ከዚህ በታች እንደሚከተለው ቀርቧል።</w:t>
       </w:r>
@@ -79,15 +88,17 @@
     <w:p>
       <w:r>
         <w:rPr>
-          <w:rFonts w:ascii="Geez 3" w:hAnsi="Geez 3"/>
-        </w:rPr>
-        <w:t xml:space="preserve"> </w:t>
-      </w:r>
-    </w:p>
-    <w:p>
-      <w:r>
-        <w:rPr>
-          <w:rFonts w:ascii="Geez 3" w:hAnsi="Geez 3"/>
+          <w:rFonts w:ascii="Nyala" w:hAnsi="Nyala"/>
+          <w:sz w:val="24"/>
+        </w:rPr>
+        <w:t xml:space="preserve"> </w:t>
+      </w:r>
+    </w:p>
+    <w:p>
+      <w:r>
+        <w:rPr>
+          <w:rFonts w:ascii="Nyala" w:hAnsi="Nyala"/>
+          <w:sz w:val="24"/>
         </w:rPr>
         <w:t>70% ---------------------------------------------------- {calc70}</w:t>
       </w:r>
@@ -95,7 +106,8 @@
     <w:p>
       <w:r>
         <w:rPr>
-          <w:rFonts w:ascii="Geez 3" w:hAnsi="Geez 3"/>
+          <w:rFonts w:ascii="Nyala" w:hAnsi="Nyala"/>
+          <w:sz w:val="24"/>
         </w:rPr>
         <w:t>30% ---------------------------------------------------- {calc30}</w:t>
       </w:r>
@@ -103,7 +115,8 @@
     <w:p>
       <w:r>
         <w:rPr>
-          <w:rFonts w:ascii="Geez 3" w:hAnsi="Geez 3"/>
+          <w:rFonts w:ascii="Nyala" w:hAnsi="Nyala"/>
+          <w:sz w:val="24"/>
         </w:rPr>
         <w:t>15% (ቫት) --------------------------------------------- {vat}</w:t>
       </w:r>
@@ -111,7 +124,8 @@
     <w:p>
       <w:r>
         <w:rPr>
-          <w:rFonts w:ascii="Geez 3" w:hAnsi="Geez 3"/>
+          <w:rFonts w:ascii="Nyala" w:hAnsi="Nyala"/>
+          <w:sz w:val="24"/>
         </w:rPr>
         <w:t>ጠቅላላ ድምር ------------------------------------------- {totalWithVAT}</w:t>
       </w:r>
@@ -119,7 +133,8 @@
     <w:p>
       <w:r>
         <w:rPr>
-          <w:rFonts w:ascii="Geez 3" w:hAnsi="Geez 3"/>
+          <w:rFonts w:ascii="Nyala" w:hAnsi="Nyala"/>
+          <w:sz w:val="24"/>
         </w:rPr>
         <w:t xml:space="preserve"> </w:t>
       </w:r>
@@ -130,7 +145,8 @@
       </w:pPr>
       <w:r>
         <w:rPr>
-          <w:rFonts w:ascii="Geez 3" w:hAnsi="Geez 3"/>
+          <w:rFonts w:ascii="Nyala" w:hAnsi="Nyala"/>
+          <w:sz w:val="24"/>
         </w:rPr>
         <w:t>ስለሆነም ተጫራቹ ገንዘቡን በድሬዳዋ ጉምሩክ ኮሚሽን ቅ/ጽ/ቤት ስም በተከፈተው 70% በቀጥታ ገቢ አካውት ቁጥር 1000014311762 በጉምርክ ኮሚሽን እና ለፍትህ ሚንስቴር 30%ቱን እና ቫቱን በዲፖዚት አካውንት 1000014260092 ሪሲት አሰርተው ሲያቀርቡ ተቆርጦ እንዲሰጣቸው እያሳሰብን የውርስ እቃ መጋዘን ሀላፊ የክፍያውን መረጃ ይዘው ሲቀርቡ ከዚህ ደብዳቤ ጋር ተያይዞ በቀረበው ዝርዝር መሰረት በሞዴል 266 ወጪ በማድረግ ንብረቱን እንድታስረክቡ እያሳሰብን ለርክክብ ይረዳ ዘንድ የእቃው ዝርዝር 1 ገጽ ከዚህ ደብዳቤ ጋር ያያዝን ሲሆን የእቃ አያያዝ ቡድንም ያሸነፉትን እቃ ክፍያ መፈፀሙን በማረጋገጥ በ 5 የስራ ቀናት ውስጥ ከመጋዘን እናዲያወጡ ለርክክብ ይረዳ ዘንድ ግልባጭ ተደርጎለታል፡፡</w:t>
       </w:r>
@@ -138,7 +154,8 @@
     <w:p>
       <w:r>
         <w:rPr>
-          <w:rFonts w:ascii="Geez 3" w:hAnsi="Geez 3"/>
+          <w:rFonts w:ascii="Nyala" w:hAnsi="Nyala"/>
+          <w:sz w:val="24"/>
         </w:rPr>
         <w:t xml:space="preserve"> </w:t>
       </w:r>
@@ -149,7 +166,8 @@
       </w:pPr>
       <w:r>
         <w:rPr>
-          <w:rFonts w:ascii="Geez 3" w:hAnsi="Geez 3"/>
+          <w:rFonts w:ascii="Nyala" w:hAnsi="Nyala"/>
+          <w:sz w:val="24"/>
         </w:rPr>
         <w:t>‹‹ከሰላምታ ጋር››</w:t>
       </w:r>
@@ -157,15 +175,17 @@
     <w:p>
       <w:r>
         <w:rPr>
-          <w:rFonts w:ascii="Geez 3" w:hAnsi="Geez 3"/>
-        </w:rPr>
-        <w:t xml:space="preserve"> </w:t>
-      </w:r>
-    </w:p>
-    <w:p>
-      <w:r>
-        <w:rPr>
-          <w:rFonts w:ascii="Geez 3" w:hAnsi="Geez 3"/>
+          <w:rFonts w:ascii="Nyala" w:hAnsi="Nyala"/>
+          <w:sz w:val="24"/>
+        </w:rPr>
+        <w:t xml:space="preserve"> </w:t>
+      </w:r>
+    </w:p>
+    <w:p>
+      <w:r>
+        <w:rPr>
+          <w:rFonts w:ascii="Nyala" w:hAnsi="Nyala"/>
+          <w:sz w:val="24"/>
           <w:b/>
           <w:u w:val="single"/>
         </w:rPr>
@@ -175,7 +195,8 @@
     <w:p>
       <w:r>
         <w:rPr>
-          <w:rFonts w:ascii="Geez 3" w:hAnsi="Geez 3"/>
+          <w:rFonts w:ascii="Nyala" w:hAnsi="Nyala"/>
+          <w:sz w:val="24"/>
         </w:rPr>
         <w:t>ለጉምሩክ ኦፕሬሽን ም/ስ/አስኪያጅ</w:t>
       </w:r>
@@ -183,7 +204,8 @@
     <w:p>
       <w:r>
         <w:rPr>
-          <w:rFonts w:ascii="Geez 3" w:hAnsi="Geez 3"/>
+          <w:rFonts w:ascii="Nyala" w:hAnsi="Nyala"/>
+          <w:sz w:val="24"/>
         </w:rPr>
         <w:t>የተያዙና የተወረሱ ንብ/አስ/የስራ ሂደት</w:t>
       </w:r>
@@ -191,7 +213,8 @@
     <w:p>
       <w:r>
         <w:rPr>
-          <w:rFonts w:ascii="Geez 3" w:hAnsi="Geez 3"/>
+          <w:rFonts w:ascii="Nyala" w:hAnsi="Nyala"/>
+          <w:sz w:val="24"/>
         </w:rPr>
         <w:t>ለኢንተለጀንስ እና ኮተረበንድ ክትትል የስራ ሂደት</w:t>
       </w:r>
@@ -199,7 +222,8 @@
     <w:p>
       <w:r>
         <w:rPr>
-          <w:rFonts w:ascii="Geez 3" w:hAnsi="Geez 3"/>
+          <w:rFonts w:ascii="Nyala" w:hAnsi="Nyala"/>
+          <w:sz w:val="24"/>
         </w:rPr>
         <w:t>ለእቃ አያያዝ ቡድን</w:t>
       </w:r>
@@ -207,7 +231,8 @@
     <w:p>
       <w:r>
         <w:rPr>
-          <w:rFonts w:ascii="Geez 3" w:hAnsi="Geez 3"/>
+          <w:rFonts w:ascii="Nyala" w:hAnsi="Nyala"/>
+          <w:sz w:val="24"/>
         </w:rPr>
         <w:t>ለውርስ እቃ አስወጋጅ ኮሚቴ</w:t>
       </w:r>
@@ -215,7 +240,8 @@
     <w:p>
       <w:r>
         <w:rPr>
-          <w:rFonts w:ascii="Geez 3" w:hAnsi="Geez 3"/>
+          <w:rFonts w:ascii="Nyala" w:hAnsi="Nyala"/>
+          <w:sz w:val="24"/>
         </w:rPr>
         <w:t>መጋዘን 1</w:t>
       </w:r>
@@ -223,7 +249,8 @@
     <w:p>
       <w:r>
         <w:rPr>
-          <w:rFonts w:ascii="Geez 3" w:hAnsi="Geez 3"/>
+          <w:rFonts w:ascii="Nyala" w:hAnsi="Nyala"/>
+          <w:sz w:val="24"/>
         </w:rPr>
         <w:t>ለበር ጥበቃ</w:t>
       </w:r>
@@ -231,7 +258,8 @@
     <w:p>
       <w:r>
         <w:rPr>
-          <w:rFonts w:ascii="Geez 3" w:hAnsi="Geez 3"/>
+          <w:rFonts w:ascii="Nyala" w:hAnsi="Nyala"/>
+          <w:sz w:val="24"/>
         </w:rPr>
         <w:t>ለድ/ለኮን/ቁጥ/ድን/ተሻ/ፖሊ/መምሪያ ሪጅመንት 14</w:t>
       </w:r>
@@ -239,7 +267,8 @@
     <w:p>
       <w:r>
         <w:rPr>
-          <w:rFonts w:ascii="Geez 3" w:hAnsi="Geez 3"/>
+          <w:rFonts w:ascii="Nyala" w:hAnsi="Nyala"/>
+          <w:sz w:val="24"/>
         </w:rPr>
         <w:t>ድ/ዳ/ጉ/ኮምሽን</w:t>
       </w:r>
@@ -247,7 +276,8 @@
     <w:p>
       <w:r>
         <w:rPr>
-          <w:rFonts w:ascii="Geez 3" w:hAnsi="Geez 3"/>
+          <w:rFonts w:ascii="Nyala" w:hAnsi="Nyala"/>
+          <w:sz w:val="24"/>
         </w:rPr>
         <w:t>አቶ {winnerName}</w:t>
       </w:r>
@@ -255,7 +285,8 @@
     <w:p>
       <w:r>
         <w:rPr>
-          <w:rFonts w:ascii="Geez 3" w:hAnsi="Geez 3"/>
+          <w:rFonts w:ascii="Nyala" w:hAnsi="Nyala"/>
+          <w:sz w:val="24"/>
         </w:rPr>
         <w:t>በ/መ</w:t>
       </w:r>

</xml_diff>